<commit_message>
Mise à jour de l'image
</commit_message>
<xml_diff>
--- a/Examen Intra.docx
+++ b/Examen Intra.docx
@@ -718,14 +718,11 @@
         </w:rPr>
       </w:pPr>
       <w:r>
-        <w:rPr>
-          <w:noProof/>
-        </w:rPr>
         <w:drawing>
-          <wp:inline distT="0" distB="0" distL="0" distR="0" wp14:anchorId="6A262127" wp14:editId="02150631">
-            <wp:extent cx="1733550" cy="1597017"/>
-            <wp:effectExtent l="0" t="0" r="0" b="3810"/>
-            <wp:docPr id="1617130033" name="Image 1"/>
+          <wp:inline distT="0" distB="0" distL="0" distR="0" wp14:anchorId="53D28308" wp14:editId="324E4665">
+            <wp:extent cx="1657350" cy="1488131"/>
+            <wp:effectExtent l="0" t="0" r="0" b="0"/>
+            <wp:docPr id="1930710423" name="Image 1"/>
             <wp:cNvGraphicFramePr>
               <a:graphicFrameLocks xmlns:a="http://schemas.openxmlformats.org/drawingml/2006/main" noChangeAspect="1"/>
             </wp:cNvGraphicFramePr>
@@ -733,7 +730,7 @@
               <a:graphicData uri="http://schemas.openxmlformats.org/drawingml/2006/picture">
                 <pic:pic xmlns:pic="http://schemas.openxmlformats.org/drawingml/2006/picture">
                   <pic:nvPicPr>
-                    <pic:cNvPr id="1617130033" name=""/>
+                    <pic:cNvPr id="1930710423" name=""/>
                     <pic:cNvPicPr/>
                   </pic:nvPicPr>
                   <pic:blipFill>
@@ -745,7 +742,7 @@
                   <pic:spPr>
                     <a:xfrm>
                       <a:off x="0" y="0"/>
-                      <a:ext cx="1744305" cy="1606925"/>
+                      <a:ext cx="1662298" cy="1492574"/>
                     </a:xfrm>
                     <a:prstGeom prst="rect">
                       <a:avLst/>

</xml_diff>